<commit_message>
Add OOP lessons 1-5
</commit_message>
<xml_diff>
--- a/modules/Введение в ООП/content/lesson_01.docx
+++ b/modules/Введение в ООП/content/lesson_01.docx
@@ -7,7 +7,7 @@
         <w:pStyle w:val="Heading1"/>
       </w:pPr>
       <w:r>
-        <w:t>Урок 1 — Классы и объекты: создаем первую модель</w:t>
+        <w:t>Урок 1 — Visual Studio, первый проект и первая идея ООП</w:t>
       </w:r>
     </w:p>
     <w:p>
@@ -171,7 +171,7 @@
     </w:p>
     <w:p>
       <w:r>
-        <w:t>К концу урока ученики смогут создать класс C#, создать 2-3 объекта этого класса через new и вывести значения их данных в консоль.</w:t>
+        <w:t>К концу урока ученики смогут создать консольный проект C# в Visual Studio, запустить программу и создать первый простой класс и объект по образцу преподавателя.</w:t>
       </w:r>
     </w:p>
     <w:p>
@@ -368,10 +368,39 @@
         <w:rPr>
           <w:b/>
         </w:rPr>
-        <w:t xml:space="preserve">Действия преподавателя: </w:t>
+        <w:t>Действия преподавателя:</w:t>
       </w:r>
+    </w:p>
+    <w:p>
+      <w:pPr>
+        <w:pStyle w:val="ListBullet"/>
+      </w:pPr>
       <w:r>
-        <w:t>–</w:t>
+        <w:t>Поприветствовать группу и проверить, что каждый ученик сидит за компьютером с Windows 10/11.</w:t>
+      </w:r>
+    </w:p>
+    <w:p>
+      <w:pPr>
+        <w:pStyle w:val="ListBullet"/>
+      </w:pPr>
+      <w:r>
+        <w:t>Попросить открыть меню Пуск и найти Visual Studio 2022. Если программы нет, отметить компьютер для отдельной настройки.</w:t>
+      </w:r>
+    </w:p>
+    <w:p>
+      <w:pPr>
+        <w:pStyle w:val="ListBullet"/>
+      </w:pPr>
+      <w:r>
+        <w:t>Показать тему урока: сегодня ученики создадут первый проект C# и увидят первую идею ООП: класс как чертеж, объект как конкретная вещь.</w:t>
+      </w:r>
+    </w:p>
+    <w:p>
+      <w:pPr>
+        <w:pStyle w:val="ListBullet"/>
+      </w:pPr>
+      <w:r>
+        <w:t>Сразу назвать практический результат: в конце урока у каждого должен быть проект `OopLesson1`, который запускается и выводит сообщение от объекта.</w:t>
       </w:r>
     </w:p>
     <w:p>
@@ -387,10 +416,12 @@
         <w:rPr>
           <w:b/>
         </w:rPr>
-        <w:t xml:space="preserve">Действия преподавателя: </w:t>
+        <w:t>Действия преподавателя:</w:t>
       </w:r>
+    </w:p>
+    <w:p>
       <w:r>
-        <w:t>–</w:t>
+        <w:t>Объяснить тему через короткую демонстрацию на экране. Не уходить в подробности .NET, файлов проекта и сложную архитектуру. Главная задача теории — дать детям карту местности: где они работают, что такое проект, что такое класс и объект.</w:t>
       </w:r>
     </w:p>
     <w:p>
@@ -398,12 +429,17 @@
         <w:pStyle w:val="Heading4"/>
       </w:pPr>
       <w:r>
-        <w:t>Класс</w:t>
+        <w:t>Visual Studio и проект</w:t>
       </w:r>
     </w:p>
     <w:p>
       <w:r>
-        <w:t>–</w:t>
+        <w:t>Visual Studio — это среда разработки: программа, в которой удобно писать код, запускать его и видеть ошибки. Проект — это папка с файлами программы. Для урока нужен тип проекта `Console App`, потому что результат будет виден в консоли.</w:t>
+      </w:r>
+    </w:p>
+    <w:p>
+      <w:r>
+        <w:t>Пример для учеников: обычный текстовый редактор похож на лист бумаги, а Visual Studio похожа на рабочий стол программиста: там есть редактор, кнопка запуска, список файлов и подсказки об ошибках.</w:t>
       </w:r>
     </w:p>
     <w:p>
@@ -411,12 +447,17 @@
         <w:pStyle w:val="Heading4"/>
       </w:pPr>
       <w:r>
-        <w:t>Объект</w:t>
+        <w:t>Класс и объект</w:t>
       </w:r>
     </w:p>
     <w:p>
       <w:r>
-        <w:t>–</w:t>
+        <w:t>Класс — это описание будущих объектов. Он говорит, какие данные и действия могут быть у объекта. Объект — это конкретная вещь, созданная по этому описанию.</w:t>
+      </w:r>
+    </w:p>
+    <w:p>
+      <w:r>
+        <w:t>Пример для школьника: класс `Cat` похож на чертеж кота в программе, а объект `barsik` — конкретный кот Барсик с именем и возрастом.</w:t>
       </w:r>
     </w:p>
     <w:p>
@@ -424,12 +465,17 @@
         <w:pStyle w:val="Heading4"/>
       </w:pPr>
       <w:r>
-        <w:t>Поле</w:t>
+        <w:t>Оператор new</w:t>
       </w:r>
     </w:p>
     <w:p>
       <w:r>
-        <w:t>–</w:t>
+        <w:t>`new` создает новый объект по классу. Если класс — это чертеж, то `new Cat()` означает: сделать одного конкретного кота по этому чертежу.</w:t>
+      </w:r>
+    </w:p>
+    <w:p>
+      <w:r>
+        <w:t>На первом уроке не нужно подробно объяснять память и устройство .NET. Достаточно закрепить фразу: класс описывает, `new` создает.</w:t>
       </w:r>
     </w:p>
     <w:p>
@@ -442,7 +488,68 @@
     </w:p>
     <w:p>
       <w:r>
-        <w:t>–</w:t>
+        <w:rPr>
+          <w:b/>
+        </w:rPr>
+        <w:t>Visual Studio</w:t>
+      </w:r>
+      <w:r>
+        <w:t xml:space="preserve"> — среда разработки, где мы пишем и запускаем C#-код.</w:t>
+      </w:r>
+    </w:p>
+    <w:p>
+      <w:r>
+        <w:rPr>
+          <w:b/>
+        </w:rPr>
+        <w:t>Проект</w:t>
+      </w:r>
+      <w:r>
+        <w:t xml:space="preserve"> — папка с файлами одной программы.</w:t>
+      </w:r>
+    </w:p>
+    <w:p>
+      <w:r>
+        <w:rPr>
+          <w:b/>
+        </w:rPr>
+        <w:t>Console App</w:t>
+      </w:r>
+      <w:r>
+        <w:t xml:space="preserve"> — консольное приложение, которое показывает результат в окне консоли.</w:t>
+      </w:r>
+    </w:p>
+    <w:p>
+      <w:r>
+        <w:rPr>
+          <w:b/>
+        </w:rPr>
+        <w:t>Класс</w:t>
+      </w:r>
+      <w:r>
+        <w:t xml:space="preserve"> — чертеж или описание будущих объектов.</w:t>
+      </w:r>
+    </w:p>
+    <w:p>
+      <w:r>
+        <w:rPr>
+          <w:b/>
+        </w:rPr>
+        <w:t>Объект</w:t>
+      </w:r>
+      <w:r>
+        <w:t xml:space="preserve"> — конкретная вещь, созданная по классу.</w:t>
+      </w:r>
+    </w:p>
+    <w:p>
+      <w:r>
+        <w:rPr>
+          <w:b/>
+        </w:rPr>
+        <w:t>new</w:t>
+      </w:r>
+      <w:r>
+        <w:t xml:space="preserve"> — команда C#, которая создает новый объект.</w:t>
       </w:r>
     </w:p>
     <w:p>
@@ -458,10 +565,12 @@
         <w:rPr>
           <w:b/>
         </w:rPr>
-        <w:t xml:space="preserve">Действия преподавателя: </w:t>
+        <w:t>Действия преподавателя:</w:t>
       </w:r>
+    </w:p>
+    <w:p>
       <w:r>
-        <w:t>–</w:t>
+        <w:t>Вести практику по схеме «показываю сам — делаем вместе — ученик повторяет небольшой шаг». После каждого блока останавливаться и проверять экран у учеников: открыт ли правильный проект, находится ли код в `Program.cs`, запустилась ли консоль.</w:t>
       </w:r>
     </w:p>
     <w:p>
@@ -474,7 +583,330 @@
     </w:p>
     <w:p>
       <w:r>
-        <w:t>–</w:t>
+        <w:t>Часть 1. Создать и запустить первый проект.</w:t>
+      </w:r>
+    </w:p>
+    <w:p>
+      <w:pPr>
+        <w:pStyle w:val="ListNumber"/>
+      </w:pPr>
+      <w:r>
+        <w:t>Нажать кнопку Пуск на панели задач Windows.</w:t>
+      </w:r>
+    </w:p>
+    <w:p>
+      <w:pPr>
+        <w:pStyle w:val="ListNumber"/>
+      </w:pPr>
+      <w:r>
+        <w:t>Ввести `Visual Studio 2022`.</w:t>
+      </w:r>
+    </w:p>
+    <w:p>
+      <w:pPr>
+        <w:pStyle w:val="ListNumber"/>
+      </w:pPr>
+      <w:r>
+        <w:t>Открыть Visual Studio 2022.</w:t>
+      </w:r>
+    </w:p>
+    <w:p>
+      <w:pPr>
+        <w:pStyle w:val="ListNumber"/>
+      </w:pPr>
+      <w:r>
+        <w:t>На стартовом экране нажать `Create a new project` или `Создать проект`.</w:t>
+      </w:r>
+    </w:p>
+    <w:p>
+      <w:pPr>
+        <w:pStyle w:val="ListNumber"/>
+      </w:pPr>
+      <w:r>
+        <w:t>В строке поиска шаблонов ввести `Console App`.</w:t>
+      </w:r>
+    </w:p>
+    <w:p>
+      <w:pPr>
+        <w:pStyle w:val="ListNumber"/>
+      </w:pPr>
+      <w:r>
+        <w:t>Выбрать шаблон `Console App` для языка C#.</w:t>
+      </w:r>
+    </w:p>
+    <w:p>
+      <w:pPr>
+        <w:pStyle w:val="ListNumber"/>
+      </w:pPr>
+      <w:r>
+        <w:t>Нажать `Next` или `Далее`.</w:t>
+      </w:r>
+    </w:p>
+    <w:p>
+      <w:pPr>
+        <w:pStyle w:val="ListNumber"/>
+      </w:pPr>
+      <w:r>
+        <w:t>В поле имени проекта ввести `OopLesson1`.</w:t>
+      </w:r>
+    </w:p>
+    <w:p>
+      <w:pPr>
+        <w:pStyle w:val="ListNumber"/>
+      </w:pPr>
+      <w:r>
+        <w:t>Проверить путь проекта. Пример: `C:\Users\Student\source\repos\OopLesson1`. Если имя пользователя другое, путь будет отличаться только этой частью.</w:t>
+      </w:r>
+    </w:p>
+    <w:p>
+      <w:pPr>
+        <w:pStyle w:val="ListNumber"/>
+      </w:pPr>
+      <w:r>
+        <w:t>Нажать `Create` или `Создать`.</w:t>
+      </w:r>
+    </w:p>
+    <w:p>
+      <w:pPr>
+        <w:pStyle w:val="ListNumber"/>
+      </w:pPr>
+      <w:r>
+        <w:t>Открыть файл `Program.cs`, если он не открылся автоматически.</w:t>
+      </w:r>
+    </w:p>
+    <w:p>
+      <w:pPr>
+        <w:pStyle w:val="ListNumber"/>
+      </w:pPr>
+      <w:r>
+        <w:t>Заменить стартовый код на короткое сообщение и запустить проект кнопкой запуска.</w:t>
+      </w:r>
+    </w:p>
+    <w:p>
+      <w:r>
+        <w:t>[СКРИНШОТ: Visual Studio 2022 — окно Create a new project с выбранным шаблоном Console App для C#]</w:t>
+      </w:r>
+    </w:p>
+    <w:p>
+      <w:r>
+        <w:t>[СКРИНШОТ: Visual Studio 2022 — Solution Explorer, открыт проект OopLesson1 и файл Program.cs]</w:t>
+      </w:r>
+    </w:p>
+    <w:p>
+      <w:r>
+        <w:t>Код для первого запуска:</w:t>
+      </w:r>
+    </w:p>
+    <w:p>
+      <w:r>
+        <w:rPr>
+          <w:rFonts w:ascii="Consolas" w:hAnsi="Consolas"/>
+          <w:sz w:val="20"/>
+        </w:rPr>
+        <w:t>Console.WriteLine("Привет! Это моя первая программа на C#.");</w:t>
+      </w:r>
+    </w:p>
+    <w:p>
+      <w:r>
+        <w:t>[СКРИНШОТ: Visual Studio 2022 — консоль после запуска программы с текстом приветствия]</w:t>
+      </w:r>
+    </w:p>
+    <w:p>
+      <w:r>
+        <w:t>Часть 2. Создать первый класс и объект.</w:t>
+      </w:r>
+    </w:p>
+    <w:p>
+      <w:r>
+        <w:t>Преподаватель сначала полностью показывает пример с котом. Во время показа проговаривать ход мысли: сначала описываем, каким может быть кот в программе, затем создаем конкретного кота и вызываем его действие.</w:t>
+      </w:r>
+    </w:p>
+    <w:p>
+      <w:r>
+        <w:rPr>
+          <w:rFonts w:ascii="Consolas" w:hAnsi="Consolas"/>
+          <w:sz w:val="20"/>
+        </w:rPr>
+        <w:t>Cat barsik = new Cat();</w:t>
+      </w:r>
+    </w:p>
+    <w:p>
+      <w:r>
+        <w:rPr>
+          <w:rFonts w:ascii="Consolas" w:hAnsi="Consolas"/>
+          <w:sz w:val="20"/>
+        </w:rPr>
+        <w:t>barsik.Name = "Барсик";</w:t>
+      </w:r>
+    </w:p>
+    <w:p>
+      <w:r>
+        <w:rPr>
+          <w:rFonts w:ascii="Consolas" w:hAnsi="Consolas"/>
+          <w:sz w:val="20"/>
+        </w:rPr>
+        <w:t>barsik.Age = 3;</w:t>
+      </w:r>
+    </w:p>
+    <w:p>
+      <w:r>
+        <w:rPr>
+          <w:rFonts w:ascii="Consolas" w:hAnsi="Consolas"/>
+          <w:sz w:val="20"/>
+        </w:rPr>
+        <w:t>barsik.SayMeow();</w:t>
+      </w:r>
+    </w:p>
+    <w:p>
+      <w:r>
+        <w:rPr>
+          <w:rFonts w:ascii="Consolas" w:hAnsi="Consolas"/>
+          <w:sz w:val="20"/>
+        </w:rPr>
+      </w:r>
+    </w:p>
+    <w:p>
+      <w:r>
+        <w:rPr>
+          <w:rFonts w:ascii="Consolas" w:hAnsi="Consolas"/>
+          <w:sz w:val="20"/>
+        </w:rPr>
+        <w:t>class Cat</w:t>
+      </w:r>
+    </w:p>
+    <w:p>
+      <w:r>
+        <w:rPr>
+          <w:rFonts w:ascii="Consolas" w:hAnsi="Consolas"/>
+          <w:sz w:val="20"/>
+        </w:rPr>
+        <w:t>{</w:t>
+      </w:r>
+    </w:p>
+    <w:p>
+      <w:r>
+        <w:rPr>
+          <w:rFonts w:ascii="Consolas" w:hAnsi="Consolas"/>
+          <w:sz w:val="20"/>
+        </w:rPr>
+        <w:t xml:space="preserve">    public string Name;</w:t>
+      </w:r>
+    </w:p>
+    <w:p>
+      <w:r>
+        <w:rPr>
+          <w:rFonts w:ascii="Consolas" w:hAnsi="Consolas"/>
+          <w:sz w:val="20"/>
+        </w:rPr>
+        <w:t xml:space="preserve">    public int Age;</w:t>
+      </w:r>
+    </w:p>
+    <w:p>
+      <w:r>
+        <w:rPr>
+          <w:rFonts w:ascii="Consolas" w:hAnsi="Consolas"/>
+          <w:sz w:val="20"/>
+        </w:rPr>
+      </w:r>
+    </w:p>
+    <w:p>
+      <w:r>
+        <w:rPr>
+          <w:rFonts w:ascii="Consolas" w:hAnsi="Consolas"/>
+          <w:sz w:val="20"/>
+        </w:rPr>
+        <w:t xml:space="preserve">    public void SayMeow()</w:t>
+      </w:r>
+    </w:p>
+    <w:p>
+      <w:r>
+        <w:rPr>
+          <w:rFonts w:ascii="Consolas" w:hAnsi="Consolas"/>
+          <w:sz w:val="20"/>
+        </w:rPr>
+        <w:t xml:space="preserve">    {</w:t>
+      </w:r>
+    </w:p>
+    <w:p>
+      <w:r>
+        <w:rPr>
+          <w:rFonts w:ascii="Consolas" w:hAnsi="Consolas"/>
+          <w:sz w:val="20"/>
+        </w:rPr>
+        <w:t xml:space="preserve">        Console.WriteLine(Name + " говорит: мяу!");</w:t>
+      </w:r>
+    </w:p>
+    <w:p>
+      <w:r>
+        <w:rPr>
+          <w:rFonts w:ascii="Consolas" w:hAnsi="Consolas"/>
+          <w:sz w:val="20"/>
+        </w:rPr>
+        <w:t xml:space="preserve">    }</w:t>
+      </w:r>
+    </w:p>
+    <w:p>
+      <w:r>
+        <w:rPr>
+          <w:rFonts w:ascii="Consolas" w:hAnsi="Consolas"/>
+          <w:sz w:val="20"/>
+        </w:rPr>
+        <w:t>}</w:t>
+      </w:r>
+    </w:p>
+    <w:p>
+      <w:r>
+        <w:t>[СКРИНШОТ: Visual Studio 2022 — Program.cs с кодом класса Cat и объектом barsik]</w:t>
+      </w:r>
+    </w:p>
+    <w:p>
+      <w:r>
+        <w:t>[СКРИНШОТ: консоль — вывод `Барсик говорит: мяу!` после запуска проекта]</w:t>
+      </w:r>
+    </w:p>
+    <w:p>
+      <w:r>
+        <w:t>Часть 3. Мини-доработка вместе с группой.</w:t>
+      </w:r>
+    </w:p>
+    <w:p>
+      <w:pPr>
+        <w:pStyle w:val="ListNumber"/>
+      </w:pPr>
+      <w:r>
+        <w:t>Попросить учеников найти строку `Cat barsik = new Cat();`.</w:t>
+      </w:r>
+    </w:p>
+    <w:p>
+      <w:pPr>
+        <w:pStyle w:val="ListNumber"/>
+      </w:pPr>
+      <w:r>
+        <w:t>Объяснить, что `barsik` — имя переменной, в которой хранится объект.</w:t>
+      </w:r>
+    </w:p>
+    <w:p>
+      <w:pPr>
+        <w:pStyle w:val="ListNumber"/>
+      </w:pPr>
+      <w:r>
+        <w:t>Заменить имя объекта или значения полей: например, `barsik.Name = "Мурка";` и `barsik.Age = 5;`.</w:t>
+      </w:r>
+    </w:p>
+    <w:p>
+      <w:pPr>
+        <w:pStyle w:val="ListNumber"/>
+      </w:pPr>
+      <w:r>
+        <w:t>Запустить программу еще раз.</w:t>
+      </w:r>
+    </w:p>
+    <w:p>
+      <w:pPr>
+        <w:pStyle w:val="ListNumber"/>
+      </w:pPr>
+      <w:r>
+        <w:t>Спросить: что изменилось в коде и что изменилось в консоли?</w:t>
       </w:r>
     </w:p>
     <w:p>
@@ -485,7 +917,7 @@
         <w:t xml:space="preserve">Ожидаемый результат: </w:t>
       </w:r>
       <w:r>
-        <w:t>–</w:t>
+        <w:t>ученик создал проект `OopLesson1`, запустил консольную программу, увидел первый класс `Cat`, создал объект через `new` и изменил данные объекта.</w:t>
       </w:r>
     </w:p>
     <w:p>
@@ -501,10 +933,12 @@
         <w:rPr>
           <w:b/>
         </w:rPr>
-        <w:t xml:space="preserve">Действия преподавателя: </w:t>
+        <w:t>Действия преподавателя:</w:t>
       </w:r>
+    </w:p>
+    <w:p>
       <w:r>
-        <w:t>–</w:t>
+        <w:t>Раздать самостоятельную задачу после совместного примера. Первые 5 минут не подсказывать код полностью: просить учеников найти похожее место в примере. Через 5 минут сделать короткую остановку и проверить, что большинство учеников создали новый объект или изменили класс.</w:t>
       </w:r>
     </w:p>
     <w:p>
@@ -517,7 +951,89 @@
     </w:p>
     <w:p>
       <w:r>
-        <w:t>–</w:t>
+        <w:t>Выбери один вариант и сделай по аналогии с примером `Cat`.</w:t>
+      </w:r>
+    </w:p>
+    <w:p>
+      <w:pPr>
+        <w:pStyle w:val="ListBullet"/>
+      </w:pPr>
+      <w:r>
+        <w:t>Вариант 1: класс `Dog` с полями `Name` и `Age`, метод `Bark()` выводит сообщение от имени собаки.</w:t>
+      </w:r>
+    </w:p>
+    <w:p>
+      <w:pPr>
+        <w:pStyle w:val="ListBullet"/>
+      </w:pPr>
+      <w:r>
+        <w:t>Вариант 2: класс `Hero` с полями `Name` и `Level`, метод `ShowInfo()` выводит имя и уровень героя.</w:t>
+      </w:r>
+    </w:p>
+    <w:p>
+      <w:pPr>
+        <w:pStyle w:val="ListBullet"/>
+      </w:pPr>
+      <w:r>
+        <w:t>Вариант 3: класс `Item` с полями `Name` и `Price`, метод `ShowInfo()` выводит название и цену предмета.</w:t>
+      </w:r>
+    </w:p>
+    <w:p>
+      <w:r>
+        <w:t>Минимальные требования:</w:t>
+      </w:r>
+    </w:p>
+    <w:p>
+      <w:pPr>
+        <w:pStyle w:val="ListNumber"/>
+      </w:pPr>
+      <w:r>
+        <w:t>Создать класс по выбранной теме.</w:t>
+      </w:r>
+    </w:p>
+    <w:p>
+      <w:pPr>
+        <w:pStyle w:val="ListNumber"/>
+      </w:pPr>
+      <w:r>
+        <w:t>Добавить минимум два поля.</w:t>
+      </w:r>
+    </w:p>
+    <w:p>
+      <w:pPr>
+        <w:pStyle w:val="ListNumber"/>
+      </w:pPr>
+      <w:r>
+        <w:t>Добавить один метод, который выводит текст в консоль.</w:t>
+      </w:r>
+    </w:p>
+    <w:p>
+      <w:pPr>
+        <w:pStyle w:val="ListNumber"/>
+      </w:pPr>
+      <w:r>
+        <w:t>Создать один объект через `new`.</w:t>
+      </w:r>
+    </w:p>
+    <w:p>
+      <w:pPr>
+        <w:pStyle w:val="ListNumber"/>
+      </w:pPr>
+      <w:r>
+        <w:t>Заполнить поля объекта.</w:t>
+      </w:r>
+    </w:p>
+    <w:p>
+      <w:pPr>
+        <w:pStyle w:val="ListNumber"/>
+      </w:pPr>
+      <w:r>
+        <w:t>Вызвать метод объекта и запустить программу.</w:t>
+      </w:r>
+    </w:p>
+    <w:p>
+      <w:r>
+        <w:t>Подсказка, если ученик застрял: сначала скопируй структуру `Cat`, затем поменяй название класса, поля, имя объекта и текст в `Console.WriteLine`.</w:t>
       </w:r>
     </w:p>
     <w:p>
@@ -567,7 +1083,7 @@
           </w:tcPr>
           <w:p>
             <w:r>
-              <w:t>Выполнено полностью самостоятельно</w:t>
+              <w:t>Проект запускается, есть свой класс, объект создан через `new`, метод вызывается и выводит корректный текст</w:t>
             </w:r>
           </w:p>
         </w:tc>
@@ -589,7 +1105,7 @@
           </w:tcPr>
           <w:p>
             <w:r>
-              <w:t>Выполнено с небольшими ошибками или подсказкой</w:t>
+              <w:t>Проект запускается, класс и объект есть, но есть небольшая ошибка в названии, тексте вывода или оформлении</w:t>
             </w:r>
           </w:p>
         </w:tc>
@@ -611,7 +1127,7 @@
           </w:tcPr>
           <w:p>
             <w:r>
-              <w:t>Выполнено частично, потребовалась помощь</w:t>
+              <w:t>Класс или объект сделан частично, программа запускается только после помощи преподавателя</w:t>
             </w:r>
           </w:p>
         </w:tc>
@@ -633,7 +1149,7 @@
           </w:tcPr>
           <w:p>
             <w:r>
-              <w:t>Не выполнено</w:t>
+              <w:t>Проект не запускается или ученик не смог создать класс и объект даже с подсказкой</w:t>
             </w:r>
           </w:p>
         </w:tc>
@@ -662,18 +1178,7 @@
         <w:rPr>
           <w:b/>
         </w:rPr>
-        <w:t xml:space="preserve">Действия преподавателя: </w:t>
-      </w:r>
-      <w:r>
-        <w:t>–</w:t>
-      </w:r>
-    </w:p>
-    <w:p>
-      <w:pPr>
-        <w:pStyle w:val="Heading4"/>
-      </w:pPr>
-      <w:r>
-        <w:t>Вопросы для рефлексии</w:t>
+        <w:t>Действия преподавателя:</w:t>
       </w:r>
     </w:p>
     <w:p>
@@ -681,7 +1186,7 @@
         <w:pStyle w:val="ListBullet"/>
       </w:pPr>
       <w:r>
-        <w:t>Что нового узнали сегодня?</w:t>
+        <w:t>Попросить 2-3 учеников показать свой объект на экране и запустить программу.</w:t>
       </w:r>
     </w:p>
     <w:p>
@@ -689,7 +1194,7 @@
         <w:pStyle w:val="ListBullet"/>
       </w:pPr>
       <w:r>
-        <w:t>Что было самым сложным?</w:t>
+        <w:t>Вернуться к формуле урока: класс описывает, объект создается через `new`, метод выполняет действие.</w:t>
       </w:r>
     </w:p>
     <w:p>
@@ -697,7 +1202,63 @@
         <w:pStyle w:val="ListBullet"/>
       </w:pPr>
       <w:r>
-        <w:t>Где это можно применить в жизни?</w:t>
+        <w:t>Коротко связать урок с Unity: в играх тоже есть объекты, у которых есть данные и действия.</w:t>
+      </w:r>
+    </w:p>
+    <w:p>
+      <w:pPr>
+        <w:pStyle w:val="ListBullet"/>
+      </w:pPr>
+      <w:r>
+        <w:t>Объяснить домашнее задание и напомнить, что его можно выполнить письменно, если дома нет Visual Studio.</w:t>
+      </w:r>
+    </w:p>
+    <w:p>
+      <w:r>
+        <w:rPr>
+          <w:b/>
+        </w:rPr>
+        <w:t>Вопросы для рефлексии:</w:t>
+      </w:r>
+    </w:p>
+    <w:p>
+      <w:pPr>
+        <w:pStyle w:val="ListBullet"/>
+      </w:pPr>
+      <w:r>
+        <w:t>Чем Visual Studio отличается от обычного текстового редактора?</w:t>
+      </w:r>
+    </w:p>
+    <w:p>
+      <w:pPr>
+        <w:pStyle w:val="ListBullet"/>
+      </w:pPr>
+      <w:r>
+        <w:t>Что такое класс простыми словами?</w:t>
+      </w:r>
+    </w:p>
+    <w:p>
+      <w:pPr>
+        <w:pStyle w:val="ListBullet"/>
+      </w:pPr>
+      <w:r>
+        <w:t>Что такое объект простыми словами?</w:t>
+      </w:r>
+    </w:p>
+    <w:p>
+      <w:pPr>
+        <w:pStyle w:val="ListBullet"/>
+      </w:pPr>
+      <w:r>
+        <w:t>Что делает `new Cat()`?</w:t>
+      </w:r>
+    </w:p>
+    <w:p>
+      <w:pPr>
+        <w:pStyle w:val="ListBullet"/>
+      </w:pPr>
+      <w:r>
+        <w:t>Где сегодня было сложнее всего: создать проект, найти `Program.cs`, написать класс или запустить программу?</w:t>
       </w:r>
     </w:p>
     <w:p>
@@ -710,7 +1271,68 @@
     </w:p>
     <w:p>
       <w:r>
-        <w:t>–</w:t>
+        <w:t>Вариант без компьютера:</w:t>
+      </w:r>
+    </w:p>
+    <w:p>
+      <w:pPr>
+        <w:pStyle w:val="ListNumber"/>
+      </w:pPr>
+      <w:r>
+        <w:t>Придумать 3 объекта из игры, фильма или реальной жизни.</w:t>
+      </w:r>
+    </w:p>
+    <w:p>
+      <w:pPr>
+        <w:pStyle w:val="ListNumber"/>
+      </w:pPr>
+      <w:r>
+        <w:t>Для каждого объекта записать, какие данные у него могут быть. Например: имя, здоровье, скорость, цена.</w:t>
+      </w:r>
+    </w:p>
+    <w:p>
+      <w:pPr>
+        <w:pStyle w:val="ListNumber"/>
+      </w:pPr>
+      <w:r>
+        <w:t>Для каждого объекта записать одно действие. Например: атаковать, мяукать, открываться, показывать информацию.</w:t>
+      </w:r>
+    </w:p>
+    <w:p>
+      <w:r>
+        <w:t>Вариант с компьютером:</w:t>
+      </w:r>
+    </w:p>
+    <w:p>
+      <w:pPr>
+        <w:pStyle w:val="ListNumber"/>
+      </w:pPr>
+      <w:r>
+        <w:t>Открыть проект `OopLesson1` в Visual Studio.</w:t>
+      </w:r>
+    </w:p>
+    <w:p>
+      <w:pPr>
+        <w:pStyle w:val="ListNumber"/>
+      </w:pPr>
+      <w:r>
+        <w:t>Создать еще один класс по аналогии с уроком.</w:t>
+      </w:r>
+    </w:p>
+    <w:p>
+      <w:pPr>
+        <w:pStyle w:val="ListNumber"/>
+      </w:pPr>
+      <w:r>
+        <w:t>Создать объект через `new`, заполнить его поля и вызвать метод.</w:t>
+      </w:r>
+    </w:p>
+    <w:p>
+      <w:pPr>
+        <w:pStyle w:val="ListNumber"/>
+      </w:pPr>
+      <w:r>
+        <w:t>Проверить, что программа запускается и выводит понятный текст.</w:t>
       </w:r>
     </w:p>
     <w:p>
@@ -730,8 +1352,51 @@
       </w:r>
     </w:p>
     <w:p>
+      <w:pPr>
+        <w:pStyle w:val="ListBullet"/>
+      </w:pPr>
       <w:r>
-        <w:t>–</w:t>
+        <w:t>Ученики могут открыть не тот шаблон проекта. Нужен именно `Console App` для C#, не библиотека и не проект для тестов.</w:t>
+      </w:r>
+    </w:p>
+    <w:p>
+      <w:pPr>
+        <w:pStyle w:val="ListBullet"/>
+      </w:pPr>
+      <w:r>
+        <w:t>Ученики могут потеряться в стартовом окне Visual Studio и не найти кнопку `Create a new project` или `Создать проект`.</w:t>
+      </w:r>
+    </w:p>
+    <w:p>
+      <w:pPr>
+        <w:pStyle w:val="ListBullet"/>
+      </w:pPr>
+      <w:r>
+        <w:t>Ученики могут открыть отдельный файл вместо проекта. Проверяйте, что в `Solution Explorer` виден проект `OopLesson1`.</w:t>
+      </w:r>
+    </w:p>
+    <w:p>
+      <w:pPr>
+        <w:pStyle w:val="ListBullet"/>
+      </w:pPr>
+      <w:r>
+        <w:t>Ученики могут не понимать, где находится файл. Проговаривайте пример полного пути: `C:\Users\Student\source\repos\OopLesson1\Program.cs`.</w:t>
+      </w:r>
+    </w:p>
+    <w:p>
+      <w:pPr>
+        <w:pStyle w:val="ListBullet"/>
+      </w:pPr>
+      <w:r>
+        <w:t>Частая синтаксическая ошибка: забытая точка с запятой, неверные фигурные скобки, разные названия класса и объекта.</w:t>
+      </w:r>
+    </w:p>
+    <w:p>
+      <w:pPr>
+        <w:pStyle w:val="ListBullet"/>
+      </w:pPr>
+      <w:r>
+        <w:t>Ученики могут путать класс и объект. Возвращайте их к формуле: класс — чертеж, объект — конкретная вещь.</w:t>
       </w:r>
     </w:p>
     <w:p>
@@ -743,8 +1408,51 @@
       </w:r>
     </w:p>
     <w:p>
+      <w:pPr>
+        <w:pStyle w:val="ListBullet"/>
+      </w:pPr>
       <w:r>
-        <w:t>–</w:t>
+        <w:t>Если ученик не может создать проект, попросите его показать экран и задайте первый вопрос: какой шаблон выбран?</w:t>
+      </w:r>
+    </w:p>
+    <w:p>
+      <w:pPr>
+        <w:pStyle w:val="ListBullet"/>
+      </w:pPr>
+      <w:r>
+        <w:t>Если ученик не видит `Program.cs`, попросите открыть `View` -&gt; `Solution Explorer` или найти панель `Solution Explorer` справа.</w:t>
+      </w:r>
+    </w:p>
+    <w:p>
+      <w:pPr>
+        <w:pStyle w:val="ListBullet"/>
+      </w:pPr>
+      <w:r>
+        <w:t>Если код не запускается, сначала попросите прочитать первую ошибку Visual Studio вслух, затем найти строку с красным подчеркиванием.</w:t>
+      </w:r>
+    </w:p>
+    <w:p>
+      <w:pPr>
+        <w:pStyle w:val="ListBullet"/>
+      </w:pPr>
+      <w:r>
+        <w:t>Если ученик путает класс и объект, спросите: `Cat` — это описание всех котов или конкретный Барсик?</w:t>
+      </w:r>
+    </w:p>
+    <w:p>
+      <w:pPr>
+        <w:pStyle w:val="ListBullet"/>
+      </w:pPr>
+      <w:r>
+        <w:t>Если ученик просит готовый код, дайте только первый шаг: найди в примере `class Cat` и замени название класса на свое.</w:t>
+      </w:r>
+    </w:p>
+    <w:p>
+      <w:pPr>
+        <w:pStyle w:val="ListBullet"/>
+      </w:pPr>
+      <w:r>
+        <w:t>Если ученик застрял на самостоятельной работе, предложите самый близкий вариант к примеру: `Dog` с методом `Bark()`.</w:t>
       </w:r>
     </w:p>
     <w:p>
@@ -756,8 +1464,35 @@
       </w:r>
     </w:p>
     <w:p>
+      <w:pPr>
+        <w:pStyle w:val="ListBullet"/>
+      </w:pPr>
       <w:r>
-        <w:t>–</w:t>
+        <w:t>Создать второй объект того же класса с другими значениями и вызвать его метод.</w:t>
+      </w:r>
+    </w:p>
+    <w:p>
+      <w:pPr>
+        <w:pStyle w:val="ListBullet"/>
+      </w:pPr>
+      <w:r>
+        <w:t>Добавить третье поле, например `Color`, `Level` или `Speed`, и вывести его в методе.</w:t>
+      </w:r>
+    </w:p>
+    <w:p>
+      <w:pPr>
+        <w:pStyle w:val="ListBullet"/>
+      </w:pPr>
+      <w:r>
+        <w:t>Изменить текст метода так, чтобы он использовал сразу два поля объекта.</w:t>
+      </w:r>
+    </w:p>
+    <w:p>
+      <w:pPr>
+        <w:pStyle w:val="ListBullet"/>
+      </w:pPr>
+      <w:r>
+        <w:t>Подготовить короткое объяснение для соседа: где в коде класс, где объект, где создание через `new`.</w:t>
       </w:r>
     </w:p>
     <w:sectPr>

</xml_diff>

<commit_message>
Update OOP lessons 1-2 assets
</commit_message>
<xml_diff>
--- a/modules/Введение в ООП/content/lesson_01.docx
+++ b/modules/Введение в ООП/content/lesson_01.docx
@@ -171,7 +171,7 @@
     </w:p>
     <w:p>
       <w:r>
-        <w:t>К концу урока ученики смогут создать консольный проект C# в Visual Studio, запустить программу и создать первый простой класс и объект по образцу преподавателя.</w:t>
+        <w:t>К концу урока ученики смогут создать консольный проект C# в Visual Studio, запустить программу, кратко объяснить, что такое ООП, и создать первый простой класс и объект по образцу преподавателя.</w:t>
       </w:r>
     </w:p>
     <w:p>
@@ -392,7 +392,7 @@
         <w:pStyle w:val="ListBullet"/>
       </w:pPr>
       <w:r>
-        <w:t>Показать тему урока: сегодня ученики создадут первый проект C# и увидят первую идею ООП: класс как чертеж, объект как конкретная вещь.</w:t>
+        <w:t>Показать тему урока: сегодня ученики создадут первый проект C# и увидят первую идею ООП: класс как шаблон, объект как конкретная вещь.</w:t>
       </w:r>
     </w:p>
     <w:p>
@@ -421,7 +421,7 @@
     </w:p>
     <w:p>
       <w:r>
-        <w:t>Объяснить тему через короткую демонстрацию на экране. Не уходить в подробности .NET, файлов проекта и сложную архитектуру. Главная задача теории — дать детям карту местности: где они работают, что такое проект, что такое класс и объект.</w:t>
+        <w:t>Объяснить тему через короткую демонстрацию на экране. Не уходить в подробности .NET, файлов проекта и сложную архитектуру. Главная задача теории — дать детям карту местности: где они работают, что такое ООП, проект, класс и объект.</w:t>
       </w:r>
     </w:p>
     <w:p>
@@ -447,6 +447,24 @@
         <w:pStyle w:val="Heading4"/>
       </w:pPr>
       <w:r>
+        <w:t>Что такое ООП и откуда оно появилось</w:t>
+      </w:r>
+    </w:p>
+    <w:p>
+      <w:r>
+        <w:t>ООП, или объектно-ориентированное программирование, — это подход, в котором программу собирают из объектов. У каждого объекта есть данные и действия: например, у героя могут быть имя и здоровье, а из действий — показать информацию или атаковать. Идея удобна тем, что большую программу можно делить на понятные части.</w:t>
+      </w:r>
+    </w:p>
+    <w:p>
+      <w:r>
+        <w:t>Короткая история: в 1960-е годы язык Simula предложил описывать в программе объекты для моделирования реальных процессов. В 1970-е язык Smalltalk сделал объектный подход центральной идеей: почти все в программе рассматривалось как объект. Позже этот подход перешел в популярные языки, включая C#, и стал особенно удобен для интерфейсов, игр и Unity-проектов.</w:t>
+      </w:r>
+    </w:p>
+    <w:p>
+      <w:pPr>
+        <w:pStyle w:val="Heading4"/>
+      </w:pPr>
+      <w:r>
         <w:t>Класс и объект</w:t>
       </w:r>
     </w:p>
@@ -457,7 +475,12 @@
     </w:p>
     <w:p>
       <w:r>
-        <w:t>Пример для школьника: класс `Cat` похож на чертеж кота в программе, а объект `barsik` — конкретный кот Барсик с именем и возрастом.</w:t>
+        <w:t>Пример для школьника: класс `Cat` похож на шаблон кота в программе, а объект `barsik` — конкретный кот Барсик с именем и возрастом.</w:t>
+      </w:r>
+    </w:p>
+    <w:p>
+      <w:r>
+        <w:t>Дополнительный пример: класс `Car` можно представить как шаблон автомобиля. В шаблоне указано, что у автомобиля есть модель, цвет и скорость, а конкретный объект `myCar` — это уже определенная машина с конкретными значениями: например, красный автомобиль с моделью `Sport` и скоростью 120.</w:t>
       </w:r>
     </w:p>
     <w:p>
@@ -470,7 +493,7 @@
     </w:p>
     <w:p>
       <w:r>
-        <w:t>`new` создает новый объект по классу. Если класс — это чертеж, то `new Cat()` означает: сделать одного конкретного кота по этому чертежу.</w:t>
+        <w:t>`new` создает новый объект по классу. Если класс — это шаблон, то `new Cat()` означает: сделать одного конкретного кота по этому шаблону.</w:t>
       </w:r>
     </w:p>
     <w:p>
@@ -513,10 +536,10 @@
         <w:rPr>
           <w:b/>
         </w:rPr>
-        <w:t>Console App</w:t>
+        <w:t>ООП</w:t>
       </w:r>
       <w:r>
-        <w:t xml:space="preserve"> — консольное приложение, которое показывает результат в окне консоли.</w:t>
+        <w:t xml:space="preserve"> — подход к программированию, где программа строится из объектов с данными и действиями.</w:t>
       </w:r>
     </w:p>
     <w:p>
@@ -527,7 +550,7 @@
         <w:t>Класс</w:t>
       </w:r>
       <w:r>
-        <w:t xml:space="preserve"> — чертеж или описание будущих объектов.</w:t>
+        <w:t xml:space="preserve"> — шаблон или описание будущих объектов.</w:t>
       </w:r>
     </w:p>
     <w:p>
@@ -979,6 +1002,14 @@
       </w:r>
     </w:p>
     <w:p>
+      <w:pPr>
+        <w:pStyle w:val="ListBullet"/>
+      </w:pPr>
+      <w:r>
+        <w:t>Вариант 4: класс `Car` с полями `Model` и `Speed`, метод `ShowInfo()` выводит модель и скорость автомобиля.</w:t>
+      </w:r>
+    </w:p>
+    <w:p>
       <w:r>
         <w:t>Минимальные требования:</w:t>
       </w:r>
@@ -1202,6 +1233,14 @@
         <w:pStyle w:val="ListBullet"/>
       </w:pPr>
       <w:r>
+        <w:t>Попросить одного ученика сформулировать ООП простыми словами: программа состоит из объектов, у которых есть данные и действия.</w:t>
+      </w:r>
+    </w:p>
+    <w:p>
+      <w:pPr>
+        <w:pStyle w:val="ListBullet"/>
+      </w:pPr>
+      <w:r>
         <w:t>Коротко связать урок с Unity: в играх тоже есть объекты, у которых есть данные и действия.</w:t>
       </w:r>
     </w:p>
@@ -1227,6 +1266,22 @@
       </w:pPr>
       <w:r>
         <w:t>Чем Visual Studio отличается от обычного текстового редактора?</w:t>
+      </w:r>
+    </w:p>
+    <w:p>
+      <w:pPr>
+        <w:pStyle w:val="ListBullet"/>
+      </w:pPr>
+      <w:r>
+        <w:t>Что такое ООП простыми словами?</w:t>
+      </w:r>
+    </w:p>
+    <w:p>
+      <w:pPr>
+        <w:pStyle w:val="ListBullet"/>
+      </w:pPr>
+      <w:r>
+        <w:t>Почему идея объектов появилась как способ удобнее описывать сложные программы?</w:t>
       </w:r>
     </w:p>
     <w:p>
@@ -1396,7 +1451,15 @@
         <w:pStyle w:val="ListBullet"/>
       </w:pPr>
       <w:r>
-        <w:t>Ученики могут путать класс и объект. Возвращайте их к формуле: класс — чертеж, объект — конкретная вещь.</w:t>
+        <w:t>История ООП может увести урок в сторону. Достаточно назвать Simula, Smalltalk и главную идею: объекты помогают описывать сложные системы понятными частями.</w:t>
+      </w:r>
+    </w:p>
+    <w:p>
+      <w:pPr>
+        <w:pStyle w:val="ListBullet"/>
+      </w:pPr>
+      <w:r>
+        <w:t>Ученики могут путать класс и объект. Возвращайте их к формуле: класс — шаблон, объект — конкретная вещь.</w:t>
       </w:r>
     </w:p>
     <w:p>
@@ -1429,6 +1492,14 @@
       </w:pPr>
       <w:r>
         <w:t>Если код не запускается, сначала попросите прочитать первую ошибку Visual Studio вслух, затем найти строку с красным подчеркиванием.</w:t>
+      </w:r>
+    </w:p>
+    <w:p>
+      <w:pPr>
+        <w:pStyle w:val="ListBullet"/>
+      </w:pPr>
+      <w:r>
+        <w:t>Если ученик не может объяснить ООП, попросите описать один игровой объект: какие у него данные и какие действия. Затем связать это с определением.</w:t>
       </w:r>
     </w:p>
     <w:p>

</xml_diff>